<commit_message>
Clarify inventory selection data vintages and manuscript contribution
</commit_message>
<xml_diff>
--- a/Review_and_Revision/IJDRR-D-26-02276/Complete_Manuscript_Revision_20260919/RESPONSE_TO_REVIEWERS.docx
+++ b/Review_and_Revision/IJDRR-D-26-02276/Complete_Manuscript_Revision_20260919/RESPONSE_TO_REVIEWERS.docx
@@ -412,7 +412,12 @@
         <w:t xml:space="preserve">Response: </w:t>
       </w:r>
       <w:r>
-        <w:t>We removed the broad claim that linking physical damage, operations, and tract consequences is itself a largely unfilled methodological gap. The revised review recognizes Los Angeles restoration scheduling (Çağnan et al., 2006; Xu et al., 2007), access-based resilience (Logan and Guikema, 2020), census-tract power-flow risk assessment (Cheng et al., 2024), and explicit equity-oriented optimization (Toplu-Tutay et al., 2024; Jiang et al., 2025). The narrower contribution is an evaluated comparison showing which burden criteria align or conflict under paired task uncertainty and two stated assumption changes. Locations: Section 1.1, final two paragraphs; Section 1.2; Sections 3–4. We do not claim to be the first study of community consequences or to improve these prior algorithms.</w:t>
+        <w:t>We rewrote the contribution around the comparison evidence that readers can use. Los Angeles restoration studies establish the importance of inspection, repair scheduling, and resource bottlenecks (Çağnan et al., 2006; Xu et al., 2007). Access-based resilience and multidimensional equity research motivate examining community consequences beyond system completion (Logan and Guikema, 2020; Lin et al., 2022). Cheng et al. (2024) assess Los Angeles census-tract seismic risk with DC load flow; Toplu-Tutay et al. (2024) explicitly incorporate equity in hardening optimization; Jiang et al. (2025) study restoration optimization under repair uncertainty. These are substantive precedents, rather than components whose assembly alone establishes a gap.</w:t>
+      </w:r>
+    </w:p>
+    <w:p>
+      <w:r>
+        <w:t>Our complementary question is how the same fixed restoration decisions are evaluated by cumulative population burden, absolute vulnerability-group burdens, and relative inequality under shared damage and workloads, and which comparisons depend on the two stated assumptions. The final Introduction paragraph now states this positive contribution: quantify small aggregate differences with different group consequences; identify who bears additional absolute burden when inequality falls; and distinguish overall directions that persist in the targeted contrasts from group judgments that remain assumption-dependent. Results provide concrete evidence: Balanced improves all four group means while widening the absolute high–low gap; Efficiency lowers Gini while increasing all four means; and the two contrasts retain overall directions but change group relationships or amplify community costs. Locations: Sections 1.1–1.2, especially the final contribution paragraph; Sections 3.1–3.3; Figures 2–4. We removed the defensive sentence about a contribution not resting on component assembly and consolidated repeated qualifications. The contribution remains conditional comparison evidence, not first-ever equity analysis, an improved optimization algorithm, or physical validation.</w:t>
       </w:r>
     </w:p>
     <w:p>
@@ -655,7 +660,17 @@
         <w:t xml:space="preserve">Response: </w:t>
       </w:r>
       <w:r>
-        <w:t>The old 92-node/318-edge model no longer supplies the revised results. The current manuscript distinguishes a 310-record retained inventory, 306 state-identified records, a 302-asset primary scheduling component, 196 SCE candidate service nodes, and 817 outcome tracts. The eight excluded task records and reasons are listed in S1.1; all 117 distinct resolved upstream attachment targets are in the task component. We do not imply that 310 is a count of every real Los Angeles electrical asset. Locations: Section 2.1; Table 1; Supplement S1.1. This separates geographic inventory coverage, network representation, repair eligibility, and reported community scope instead of using one reduced count for all four.</w:t>
+        <w:t>The retained historical candidate-facility table contains 486 records. The old model had 92 nodes and 318 edges, but the historical rule selecting those 92 from the 486 could not be recovered. We now state that gap directly; replacing the old model does not recover or justify its original reduction. The 486 records were a facility candidate table, not a documented complete original electrical graph, so we cannot give a defensible complete-network size for that historical starting point.</w:t>
+      </w:r>
+    </w:p>
+    <w:p>
+      <w:r>
+        <w:t>The revised results instead use the documented inventory chain: 4,260 upstream database records → 3,374 SUBSTATION records → 2,775 IN SERVICE records → 2,548 with valid coordinates and original maximum voltage at least 34.5 kV → 310 covered by the fixed study-area polygon. The polygon is the union of 2,315 retained tract geometries; ownership and largest-component membership do not select the inventory. The predeclared boundary-source exception added no records. The 4,260 count is a database inventory, not the node count of the complete Los Angeles electrical system. Of the 310 retained records, 306 have identified network states and the 302-asset main component defines the task domain; the eight excluded task records and their reasons remain listed explicitly.</w:t>
+      </w:r>
+    </w:p>
+    <w:p>
+      <w:r>
+        <w:t>We also added how the line geometry becomes facility adjacency. Physical line-graph paths are blocked by intervening registered station nodes or projection anchors. The retained facility graph has 310 nodes and 1,040 undirected edges; its largest component has 302 assets, including all 117 resolved SCE upstream attachment targets. These geometric rules do not validate electrical switching or capacity. Locations: Methods 2.1 gives the selection overview and current graph scale; Supplement S1.1 gives the historical gap, full selection chain, intermediate-station rule, and component sizes; Table S6 identifies retained data vintages and unresolved dates. Evidence: the existing PROVENANCE_DECISION.md and R1_310_LOCAL_CLOSURE_REPORT.md. No network was rebuilt and no scientific result was changed for this clarification.</w:t>
       </w:r>
     </w:p>
     <w:p>

</xml_diff>